<commit_message>
Update study notes and resources for all languages for 2026-06-25 release
</commit_message>
<xml_diff>
--- a/swh/docx/01.content.docx
+++ b/swh/docx/01.content.docx
@@ -2686,116 +2686,6 @@
           <w:lang w:val="sw_KE" w:bidi="sw_KE"/>
         </w:rPr>
         <w:t>Kisha Mungu alimsaidia Yosefu kuelewa maana ya ndoto za Farao. Baada ya hapo, Farao alimteua Yosefu kuwa mtawala wa Misri yote. Yosefu alihakikisha kwamba kutakuwa na chakula cha kutosha wakati wa miaka ya njaa kali.</w:t>
-      </w:r>
-      <w:r>
-        <w:rPr>
-          <w:lang w:val="sw_KE" w:bidi="sw_KE"/>
-        </w:rPr>
-      </w:r>
-      <w:r>
-        <w:rPr>
-          <w:lang w:val="sw_KE" w:bidi="sw_KE"/>
-        </w:rPr>
-      </w:r>
-    </w:p>
-    <w:p>
-      <w:pPr/>
-      <w:r>
-        <w:rPr>
-          <w:lang w:val="sw_KE" w:bidi="sw_KE"/>
-        </w:rPr>
-      </w:r>
-    </w:p>
-    <w:p>
-      <w:pPr>
-        <w:pStyle w:val="Heading2"/>
-      </w:pPr>
-      <w:r>
-        <w:rPr>
-          <w:lang w:val="sw_KE" w:bidi="sw_KE"/>
-        </w:rPr>
-      </w:r>
-    </w:p>
-    <w:p>
-      <w:pPr/>
-      <w:r>
-        <w:rPr>
-          <w:lang w:val="sw_KE" w:bidi="sw_KE"/>
-        </w:rPr>
-      </w:r>
-      <w:r>
-        <w:rPr>
-          <w:lang w:val="sw_KE" w:bidi="sw_KE"/>
-        </w:rPr>
-        <w:t xml:space="preserve">Yakobo hakutaka kumtuma </w:t>
-      </w:r>
-      <w:r>
-        <w:rPr>
-          <w:lang w:val="sw_KE" w:bidi="sw_KE"/>
-        </w:rPr>
-        <w:t>Benyamini</w:t>
-      </w:r>
-      <w:r>
-        <w:rPr>
-          <w:lang w:val="sw_KE" w:bidi="sw_KE"/>
-        </w:rPr>
-        <w:t xml:space="preserve"> kwenda Misri kununua chakula. Aliogopa kumpoteza kama alivyompoteza Yosefu.</w:t>
-      </w:r>
-    </w:p>
-    <w:p>
-      <w:pPr/>
-      <w:r>
-        <w:rPr>
-          <w:lang w:val="sw_KE" w:bidi="sw_KE"/>
-        </w:rPr>
-      </w:r>
-      <w:r>
-        <w:rPr>
-          <w:lang w:val="sw_KE" w:bidi="sw_KE"/>
-        </w:rPr>
-        <w:t>Yosefu aliwajaribu ndugu zake kumi kwa kuwafanya wamlete Benyamini Misri. Kisha aliwajaribu kuona kama wangemtendea Benyamini vibaya.</w:t>
-      </w:r>
-    </w:p>
-    <w:p>
-      <w:pPr/>
-      <w:r>
-        <w:rPr>
-          <w:lang w:val="sw_KE" w:bidi="sw_KE"/>
-        </w:rPr>
-      </w:r>
-      <w:r>
-        <w:rPr>
-          <w:lang w:val="sw_KE" w:bidi="sw_KE"/>
-        </w:rPr>
-        <w:t>Yuda alikuwa amebadilika tangu alipomuuza Yosefu utumwani. Alijitolea kubaki kama mtumwa wa Yosefu ili Benyamini aweze kuondoka huru.</w:t>
-      </w:r>
-    </w:p>
-    <w:p>
-      <w:pPr/>
-      <w:r>
-        <w:rPr>
-          <w:lang w:val="sw_KE" w:bidi="sw_KE"/>
-        </w:rPr>
-      </w:r>
-      <w:r>
-        <w:rPr>
-          <w:lang w:val="sw_KE" w:bidi="sw_KE"/>
-        </w:rPr>
-        <w:t>Kisha ndugu kumi walijua kwamba Yosefu mtawala wa Misri alikuwa ndugu yao Yosefu. Waliogopa kile ambacho angewafanyia. Lakini Yosefu aliwasamehe. Alieleza jinsi Mungu alivyofanya mambo mazuri yatokee hata kutokana na matendo yao maovu.</w:t>
-      </w:r>
-    </w:p>
-    <w:p>
-      <w:pPr/>
-      <w:r>
-        <w:rPr>
-          <w:lang w:val="sw_KE" w:bidi="sw_KE"/>
-        </w:rPr>
-      </w:r>
-      <w:r>
-        <w:rPr>
-          <w:lang w:val="sw_KE" w:bidi="sw_KE"/>
-        </w:rPr>
-        <w:t>Ndoto ya Yosefu kutoka alipokuwa kijana mdogo ilitimia. Ndoto hiyo ilirekodiwa katika Mwanzo 37:5–11. Ndugu zake walimuonyesha heshima. Lakini ndugu hao hawakuchukiana tena wala kuwa na wivu. Badala yake, walilia na kukumbatiana na kuzungumza pamoja.</w:t>
       </w:r>
       <w:r>
         <w:rPr>

</xml_diff>